<commit_message>
refactor: rename package from com.example.grades to com.grades
</commit_message>
<xml_diff>
--- a/软件工程_实践/080901-软件工程（实践报告）.docx
+++ b/软件工程_实践/080901-软件工程（实践报告）.docx
@@ -105,7 +105,24 @@
           <w:rFonts w:ascii="Arial" w:hAnsi="Arial" w:eastAsia="等线" w:cs="Arial"/>
           <w:sz w:val="22"/>
         </w:rPr>
-        <w:t>提交日期：2026-04-23  命题教师：石雷</w:t>
+        <w:t xml:space="preserve">提交日期：2026-04-23  </w:t>
+      </w:r>
+      <w:r>
+        <w:rPr>
+          <w:rFonts w:hint="eastAsia" w:ascii="Arial" w:hAnsi="Arial" w:eastAsia="等线" w:cs="Arial"/>
+          <w:sz w:val="22"/>
+          <w:lang w:val="en-US" w:eastAsia="zh-CN"/>
+        </w:rPr>
+        <w:t>指导老师</w:t>
+      </w:r>
+      <w:bookmarkStart w:id="22" w:name="_GoBack"/>
+      <w:bookmarkEnd w:id="22"/>
+      <w:r>
+        <w:rPr>
+          <w:rFonts w:ascii="Arial" w:hAnsi="Arial" w:eastAsia="等线" w:cs="Arial"/>
+          <w:sz w:val="22"/>
+        </w:rPr>
+        <w:t>：石雷</w:t>
       </w:r>
     </w:p>
     <w:p>
@@ -1752,8 +1769,6 @@
         </w:rPr>
         <w:t>通过本次实践，我完整完成了软件工程全流程开发，用Spring Boot框架搭建了学生成绩管理系统，掌握了JPA和Thymeleaf的基本使用，将理论用到了实际中。我也明白，软件工程不只是写代码，前期的分析和设计很重要，UML建模和分层架构设计让开发更顺利。今后我会继续学习，提升自己的开发能力。</w:t>
       </w:r>
-      <w:bookmarkStart w:id="22" w:name="_GoBack"/>
-      <w:bookmarkEnd w:id="22"/>
     </w:p>
     <w:sectPr>
       <w:headerReference r:id="rId3" w:type="default"/>
@@ -2334,7 +2349,7 @@
     <w:lsdException w:qFormat="1" w:unhideWhenUsed="0" w:uiPriority="0" w:semiHidden="0" w:name="Title"/>
     <w:lsdException w:unhideWhenUsed="0" w:uiPriority="0" w:semiHidden="0" w:name="Closing"/>
     <w:lsdException w:unhideWhenUsed="0" w:uiPriority="0" w:semiHidden="0" w:name="Signature"/>
-    <w:lsdException w:unhideWhenUsed="0" w:uiPriority="0" w:name="Default Paragraph Font"/>
+    <w:lsdException w:qFormat="1" w:unhideWhenUsed="0" w:uiPriority="0" w:name="Default Paragraph Font"/>
     <w:lsdException w:unhideWhenUsed="0" w:uiPriority="0" w:semiHidden="0" w:name="Body Text"/>
     <w:lsdException w:unhideWhenUsed="0" w:uiPriority="0" w:semiHidden="0" w:name="Body Text Indent"/>
     <w:lsdException w:unhideWhenUsed="0" w:uiPriority="0" w:semiHidden="0" w:name="List Continue"/>
@@ -2527,6 +2542,7 @@
       <w:jc w:val="both"/>
     </w:pPr>
     <w:rPr>
+      <w:rFonts w:asciiTheme="minorHAnsi" w:hAnsiTheme="minorHAnsi" w:eastAsiaTheme="minorEastAsia" w:cstheme="minorBidi"/>
       <w:sz w:val="21"/>
       <w:szCs w:val="22"/>
     </w:rPr>
@@ -2534,6 +2550,7 @@
   <w:style w:type="character" w:default="1" w:styleId="3">
     <w:name w:val="Default Paragraph Font"/>
     <w:semiHidden/>
+    <w:qFormat/>
     <w:uiPriority w:val="0"/>
   </w:style>
   <w:style w:type="table" w:default="1" w:styleId="2">

</xml_diff>